<commit_message>
Record Roland's decisions on archiving cohort evidence
All five recommendations adopted on 25 September. Decision 5, marked
for Heidi, stands unless she overturns it; decision 6, the source of
the five-year period, remains hers to supply and does not hold up the
build. The build happens on a branch so nothing half-finished reaches
live.

Co-Authored-By: Claude Opus 5.5 <noreply@anthropic.com>
</commit_message>
<xml_diff>
--- a/FOR-ROLAND-archiving-cohort-evidence.docx
+++ b/FOR-ROLAND-archiving-cohort-evidence.docx
@@ -1516,6 +1516,29 @@
     </w:p>
     <w:p>
       <w:pPr>
+        <w:spacing w:after="140"/>
+      </w:pPr>
+      <w:r>
+        <w:rPr>
+          <w:rFonts w:ascii="Inter" w:hAnsi="Inter"/>
+          <w:b/>
+          <w:color w:val="1A1A1A"/>
+          <w:sz w:val="21"/>
+        </w:rPr>
+        <w:t>Decided by Roland, 25 September: all five recommendations adopted.</w:t>
+      </w:r>
+      <w:r>
+        <w:rPr>
+          <w:rFonts w:ascii="Inter" w:hAnsi="Inter"/>
+          <w:b w:val="0"/>
+          <w:color w:val="1A1A1A"/>
+          <w:sz w:val="21"/>
+        </w:rPr>
+        <w:t xml:space="preserve"> The provider keeps the archive, with a second copy off-site once 10.4 exists; the archive is handed back and checked before any file is removed; only a provider administrator may archive; the archive is a single file that opens in a browser; and a cohort is archived without anyone resitting, who follow once their own certificate is issued. Decision 5 was marked for Heidi and she may still overturn it before any real archive is made. Decision 6, the source of the five-year period, is still Heidi's to supply and does not hold up the build.</w:t>
+      </w:r>
+    </w:p>
+    <w:p>
+      <w:pPr>
         <w:keepNext/>
         <w:spacing w:before="280" w:after="60"/>
         <w:pBdr>

</xml_diff>